<commit_message>
econometric baselines (GARCH/EGARCH/HAR-RV) on Oxford-Man RV
</commit_message>
<xml_diff>
--- a/Report Draft/Chapter1-Introduction.docx
+++ b/Report Draft/Chapter1-Introduction.docx
@@ -24,13 +24,7 @@
         <w:jc w:val="both"/>
       </w:pPr>
       <w:r>
-        <w:t>Financial markets are defined less by the steady drift of prices than by the irregular intensity with which those prices fluctuate. The collapse of Lehman Brothers in September 2008 wiped trillions of dollars from global equity markets within weeks (Brunnermeier, 2009), and in March 2020 the COVID-19 pandemic drove the CBOE Volatility Index (VIX) to a closing peak of 82.69, surpassing levels last observed during the global financial crisis (Baker et al., 2020). Such episodes are not statistical anomalies but manifestations of well-documented stylised facts</w:t>
-      </w:r>
-      <w:r>
-        <w:t>, where</w:t>
-      </w:r>
-      <w:r>
-        <w:t xml:space="preserve"> volatility is persistent, clustered, leptokurtic, and asymmetric in its response to negative shocks (Mandelbrot, 1963; Cont, 2001). These properties have made the modelling and forecasting of conditional volatility one of the most heavily studied problems in financial econometrics, since accurate forecasts directly inform the pricing of derivatives, the calibration of value-at-risk models, and the regulatory capital that banks must hold against trading exposures (Poon and Granger, 2003).</w:t>
+        <w:t xml:space="preserve">Financial markets are defined less by the steady drift of prices than by the irregular intensity with which those prices fluctuate. The collapse of Lehman Brothers in September 2008 wiped trillions of dollars from global equity markets within weeks (Brunnermeier, 2009), and in March 2020 the COVID-19 pandemic drove the CBOE Volatility Index (VIX) to a closing peak of 82.69, surpassing levels last observed during the global financial crisis (Baker et al., 2020). Such episodes are not statistical anomalies but manifestations of well-documented stylised facts, where volatility is persistent, clustered, leptokurtic, and asymmetric in its response to negative shocks (Mandelbrot, 1963; Cont, 2001). These properties have made the modelling and forecasting of conditional volatility one of the most heavily studied problems in financial econometrics, since accurate forecasts directly inform the pricing of derivatives, the calibration of value-at-risk models, and the regulatory capital that banks must hold against trading exposures (Poon and Granger, 2003).</w:t>
       </w:r>
     </w:p>
     <w:p>
@@ -47,19 +41,7 @@
         <w:jc w:val="both"/>
       </w:pPr>
       <w:r>
-        <w:t>The practical and societal significance of volatility forecasting is therefore substantial. Risk managers depend on volatility estimates to size positions, allocate capital, and stress-test portfolios</w:t>
-      </w:r>
-      <w:r>
-        <w:t>, while</w:t>
-      </w:r>
-      <w:r>
-        <w:t xml:space="preserve"> derivatives traders rely on them to price contingent claims and regulators use them to assess systemic stability under the Basel framework. Errors in these estimates are not academic</w:t>
-      </w:r>
-      <w:r>
-        <w:t xml:space="preserve">, </w:t>
-      </w:r>
-      <w:r>
-        <w:t>underestimating volatility during a regime shift can leave institutions undercapitalised and contribute to the procyclical deleveraging that has historically amplified crises (Brunnermeier and Pedersen, 2009). The increasing availability of high-frequency data has supported a shift toward realised volatility measures constructed from intraday returns, which provide model-free estimates of latent return variation (Andersen et al., 2003), and there has been a corresponding push to move beyond traditional point forecasts toward models that quantify the uncertainty around their predictions and remain robust when market dynamics change abruptly.</w:t>
+        <w:t xml:space="preserve">The practical and societal significance of volatility forecasting is therefore substantial. Risk managers depend on volatility estimates to size positions, allocate capital, and stress-test portfolios, while derivatives traders rely on them to price contingent claims and regulators use them to assess systemic stability under the Basel framework. Errors in these estimates are not academic, underestimating volatility during a regime shift can leave institutions undercapitalised and contribute to the procyclical deleveraging that has historically amplified crises (Brunnermeier and Pedersen, 2009). The increasing availability of high-frequency data has supported a shift toward realised volatility measures constructed from intraday returns, which provide model-free estimates of latent return variation (Andersen et al., 2003), and there has been a corresponding push to move beyond traditional point forecasts toward models that quantify the uncertainty around their predictions and remain robust when market dynamics change abruptly.</w:t>
       </w:r>
     </w:p>
     <w:p>
@@ -77,22 +59,8 @@
       </w:pPr>
       <w:r>
         <w:t xml:space="preserve">The dominant econometric framework for conditional volatility, originating with the Autoregressive Conditional Heteroskedasticity (ARCH) model of Engle (1982) and its </w:t>
-      </w:r>
-      <w:r>
         <w:lastRenderedPageBreak/>
-        <w:t>generalised variant (GARCH) introduced by Bollerslev (1986), has been remarkably durable because of its parsimony, interpretability, and theoretical grounding. However, GARCH-family models impose a fixed parametric structure on the conditional variance equation and assume that the data-generating process is broadly stable over the estimation window. Empirically, financial markets violate this assumption</w:t>
-      </w:r>
-      <w:r>
-        <w:t>, where</w:t>
-      </w:r>
-      <w:r>
-        <w:t xml:space="preserve"> they shift between distinct regimes characterised by different mean returns, volatility levels, and correlation structures (Hamilton, 1989), and a single GARCH specification calibrated across regimes tends to deteriorate precisely when forecasts matter most</w:t>
-      </w:r>
-      <w:r>
-        <w:t xml:space="preserve">, </w:t>
-      </w:r>
-      <w:r>
-        <w:t>during transitions and crises (Poon and Granger, 2003).</w:t>
+        <w:t xml:space="preserve">generalised variant (GARCH) introduced by Bollerslev (1986), has been remarkably durable because of its parsimony, interpretability, and theoretical grounding. However, GARCH-family models impose a fixed parametric structure on the conditional variance equation and assume that the data-generating process is broadly stable over the estimation window. Empirically, financial markets violate this assumption, where they shift between distinct regimes characterised by different mean returns, volatility levels, and correlation structures (Hamilton, 1989), and a single GARCH specification calibrated across regimes tends to deteriorate precisely when forecasts matter most, during transitions and crises (Poon and Granger, 2003).</w:t>
       </w:r>
     </w:p>
     <w:p>
@@ -101,25 +69,7 @@
         <w:jc w:val="both"/>
       </w:pPr>
       <w:r>
-        <w:t>Deep learning offers a complementary route. Recurrent architectures, and in particular Long Short-Term Memory (LSTM) networks (Hochreiter and Schmidhuber, 1997), can capture non-linear, long-range temporal dependencies without imposing an explicit parametric form on the variance process. Hybrid and pure</w:t>
-      </w:r>
-      <w:r>
-        <w:t xml:space="preserve"> </w:t>
-      </w:r>
-      <w:r>
-        <w:t>deep</w:t>
-      </w:r>
-      <w:r>
-        <w:t xml:space="preserve"> </w:t>
-      </w:r>
-      <w:r>
-        <w:t>learning approaches have been shown to outperform GARCH baselines on equity volatility prediction in several recent studies (Kim and Won, 2018; Bucci, 2020). Yet two limitations persist. First, standard LSTM training treats the entire time series as homogeneous, so the model receives no explicit signal that, for example, March 2020 differs structurally from June 2017. Second, the networks output point predictions, providing no calibrated measure of how confident the forecast is</w:t>
-      </w:r>
-      <w:r>
-        <w:t>,</w:t>
-      </w:r>
-      <w:r>
-        <w:t xml:space="preserve"> an omission that is particularly damaging for downstream risk applications, where decision-making depends on the full predictive distribution rather than its mean (Gal and Ghahramani, 2016).</w:t>
+        <w:t xml:space="preserve">Deep learning offers a complementary route. Recurrent architectures, and in particular Long Short-Term Memory (LSTM) networks (Hochreiter and Schmidhuber, 1997), can capture non-linear, long-range temporal dependencies without imposing an explicit parametric form on the variance process. Hybrid and pure deep learning approaches have been shown to outperform GARCH baselines on equity volatility prediction in several recent studies (Kim and Won, 2018; Bucci, 2020). Yet two limitations persist. First, standard LSTM training treats the entire time series as homogeneous, so the model receives no explicit signal that, for example, March 2020 differs structurally from June 2017. Second, the networks output point predictions, providing no calibrated measure of how confident the forecast is, an omission that is particularly damaging for downstream risk applications, where decision-making depends on the full predictive distribution rather than its mean (Gal and Ghahramani, 2016).</w:t>
       </w:r>
     </w:p>
     <w:p>
@@ -154,16 +104,8 @@
       </w:pPr>
       <w:r>
         <w:t xml:space="preserve">The aim of this research is to investigate whether regime-aware deep learning models endowed with uncertainty quantification can deliver more accurate and more reliable forecasts of realised equity-index volatility than either classical econometric models or standard deep learning baselines. To pursue this aim, four objectives are pursued: (i) to implement and </w:t>
-      </w:r>
-      <w:r>
         <w:lastRenderedPageBreak/>
-        <w:t>benchmark econometric baselines, specifically GARCH(1,1) and</w:t>
-      </w:r>
-      <w:r>
-        <w:t xml:space="preserve"> </w:t>
-      </w:r>
-      <w:r>
-        <w:t>EGARCH, on realised volatility constructed from daily log returns; (ii) to develop an LSTM baseline that uses identical inputs and forecast horizons, isolating the contribution of the deep architecture; (iii) to identify latent market regimes using probabilistic state-space methods, principally Hidden Markov Models, and to condition the deep model on the inferred state; and (iv) to integrate uncertainty quantification through Monte Carlo Dropout and quantile regression, evaluating both the sharpness and the calibration of the resulting predictive intervals.</w:t>
+        <w:t xml:space="preserve">benchmark econometric baselines, specifically GARCH(1,1) and EGARCH, on daily realised volatility constructed from intraday returns; (ii) to develop an LSTM baseline that uses identical inputs and forecast horizons, isolating the contribution of the deep architecture; (iii) to identify latent market regimes using probabilistic state-space methods, principally Hidden Markov Models, and to condition the deep model on the inferred state; and (iv) to integrate uncertainty quantification through Monte Carlo Dropout and quantile regression, evaluating both the sharpness and the calibration of the resulting predictive intervals.</w:t>
       </w:r>
     </w:p>
     <w:p>
@@ -227,19 +169,7 @@
         <w:jc w:val="both"/>
       </w:pPr>
       <w:r>
-        <w:t>Methodologically, the project combines econometric, deep learning, and probabilistic components within a unified comparative-evaluation design. Realised volatility is constructed from daily log returns via rolling windows</w:t>
-      </w:r>
-      <w:r>
-        <w:t>,</w:t>
-      </w:r>
-      <w:r>
-        <w:t xml:space="preserve"> econometric and deep-learning models are trained under a strict time-ordered split with rolling out-of-sample evaluation to prevent look-ahead bias</w:t>
-      </w:r>
-      <w:r>
-        <w:t>,</w:t>
-      </w:r>
-      <w:r>
-        <w:t xml:space="preserve"> regimes are inferred from observable market signals using a Gaussian-emission HMM and uncertainty is estimated using stochastic forward passes (MC Dropout) and quantile-based loss functions. Models are compared on point-forecast metrics (MSE, MAE, QLIKE) and, for uncertainty-aware variants, on coverage and interval score, with the Diebold–Mariano test used to assess statistical significance of pairwise differences.</w:t>
+        <w:t xml:space="preserve">Methodologically, the project combines econometric, deep learning, and probabilistic components within a unified comparative-evaluation design. Realised volatility is measured as daily realised variance built from five-minute intraday returns (Andersen et al., 2003), sourced from the Oxford-Man Realized Library, econometric and deep-learning models are trained under a strict time-ordered split with rolling out-of-sample evaluation to prevent look-ahead bias, regimes are inferred from observable market signals using a Gaussian-emission HMM and uncertainty is estimated using stochastic forward passes (MC Dropout) and quantile-based loss functions. Models are compared on point-forecast metrics (MSE, MAE, QLIKE) and, for uncertainty-aware variants, on coverage and interval score, with the Diebold–Mariano test used to assess statistical significance of pairwise differences.</w:t>
       </w:r>
     </w:p>
     <w:p>
@@ -256,11 +186,7 @@
         <w:jc w:val="both"/>
       </w:pPr>
       <w:r>
-        <w:t xml:space="preserve">The empirical analysis is conducted on daily data for the S&amp;P 500 (^GSPC) and the CBOE Volatility Index (^VIX) obtained from Yahoo Finance via the yfinance interface, supplemented where appropriate by individual large-cap equities. These series are widely used in both academic and industry settings, span multiple distinct market regimes including the 2008 crisis, </w:t>
-      </w:r>
-      <w:r>
-        <w:lastRenderedPageBreak/>
-        <w:t>the 2018 volatility shock, and the COVID-19 pandemic, and provide a transparent, fully reproducible foundation for the experiments that follow.</w:t>
+        <w:t xml:space="preserve">The empirical analysis draws on two complementary data sources. The forecasting target is the daily realised variance of the S&amp;P 500, constructed from five-minute intraday returns in the sense of Andersen et al. (2003) and obtained from the Oxford-Man Realized Library (Heber et al., 2009); the series runs from 2000 to February 2022, when the library was discontinued, and this defines the sample period. Daily market data for the S&amp;P 500 (^GSPC) and the CBOE Volatility Index (^VIX) are taken from Yahoo Finance via the yfinance interface, supplemented where appropriate by individual large-cap equities; these supply the daily returns used by the GARCH-family baselines, the VIX as an auxiliary feature, and the Yang–Zhang OHLC estimator retained as a robustness check on the realised-volatility target. Together the series span multiple distinct market regimes, including the 2008 global financial crisis, the 2018 volatility shock, and the COVID-19 pandemic, and provide a transparent, fully reproducible foundation for the experiments that follow.</w:t>
       </w:r>
     </w:p>
     <w:p>
@@ -377,6 +303,15 @@
       </w:pPr>
       <w:r>
         <w:t>Hamilton, J.D., 1989. A new approach to the economic analysis of nonstationary time series and the business cycle. Econometrica, 57(2), pp.357–384. https://doi.org/10.2307/1912559</w:t>
+      </w:r>
+    </w:p>
+    <w:p>
+      <w:pPr>
+        <w:spacing w:after="140" w:line="320" w:lineRule="auto"/>
+        <w:ind w:left="720" w:hanging="720"/>
+      </w:pPr>
+      <w:r>
+        <w:t>Heber, G., Lunde, A., Shephard, N. and Sheppard, K., 2009. Oxford-Man Institute’s realized library. Oxford-Man Institute, University of Oxford.</w:t>
       </w:r>
     </w:p>
     <w:p>

</xml_diff>

<commit_message>
LSTM model with its test cases - tiny alterations in chapter 1
</commit_message>
<xml_diff>
--- a/Report Draft/Chapter1-Introduction.docx
+++ b/Report Draft/Chapter1-Introduction.docx
@@ -103,9 +103,7 @@
         <w:jc w:val="both"/>
       </w:pPr>
       <w:r>
-        <w:t xml:space="preserve">The aim of this research is to investigate whether regime-aware deep learning models endowed with uncertainty quantification can deliver more accurate and more reliable forecasts of realised equity-index volatility than either classical econometric models or standard deep learning baselines. To pursue this aim, four objectives are pursued: (i) to implement and </w:t>
-        <w:lastRenderedPageBreak/>
-        <w:t xml:space="preserve">benchmark econometric baselines, specifically GARCH(1,1) and EGARCH, on daily realised volatility constructed from intraday returns; (ii) to develop an LSTM baseline that uses identical inputs and forecast horizons, isolating the contribution of the deep architecture; (iii) to identify latent market regimes using probabilistic state-space methods, principally Hidden Markov Models, and to condition the deep model on the inferred state; and (iv) to integrate uncertainty quantification through Monte Carlo Dropout and quantile regression, evaluating both the sharpness and the calibration of the resulting predictive intervals.</w:t>
+        <w:t>The aim of this research is to investigate whether regime-aware deep learning models endowed with uncertainty quantification can deliver more accurate and more reliable forecasts of realised equity-index volatility than either classical econometric models or standard deep learning baselines. To pursue this aim, four objectives are pursued: (i) to implement and benchmark econometric baselines, specifically GARCH(1,1) and EGARCH, on daily realised volatility constructed from intraday returns; (ii) to develop an LSTM baseline over the same forecast horizon and evaluation splits, given an input set comparable to the econometric baselines — realised-volatility history as used by HAR-RV together with the daily return used by the GARCH family — and, to separate the contribution of the deep architecture from that of the richer input set, to benchmark alongside it a realised-volatility-only LSTM whose inputs match HAR-RV exactly; (iii) to identify latent market regimes using probabilistic state-space methods, principally Hidden Markov Models, and to condition the deep model on the inferred state; and (iv) to integrate uncertainty quantification through Monte Carlo Dropout and quantile regression, evaluating both the sharpness and the calibration of the resulting predictive intervals.</w:t>
       </w:r>
     </w:p>
     <w:p>

</xml_diff>

<commit_message>
tailoring staled files + refining the report
</commit_message>
<xml_diff>
--- a/Report Draft/Chapter1-Introduction.docx
+++ b/Report Draft/Chapter1-Introduction.docx
@@ -103,7 +103,7 @@
         <w:jc w:val="both"/>
       </w:pPr>
       <w:r>
-        <w:t>The aim of this research is to investigate whether regime-aware deep learning models endowed with uncertainty quantification can deliver more accurate and more reliable forecasts of realised equity-index volatility than either classical econometric models or standard deep learning baselines. To pursue this aim, four objectives are pursued: (i) to implement and benchmark econometric baselines, specifically GARCH(1,1) and EGARCH, on daily realised volatility constructed from intraday returns; (ii) to develop an LSTM baseline over the same forecast horizon and evaluation splits, given an input set comparable to the econometric baselines — realised-volatility history as used by HAR-RV together with the daily return used by the GARCH family — and, to separate the contribution of the deep architecture from that of the richer input set, to benchmark alongside it a realised-volatility-only LSTM whose inputs match HAR-RV exactly; (iii) to identify latent market regimes using probabilistic state-space methods, principally Hidden Markov Models, and to condition the deep model on the inferred state; and (iv) to integrate uncertainty quantification through Monte Carlo Dropout and quantile regression, evaluating both the sharpness and the calibration of the resulting predictive intervals.</w:t>
+        <w:t>The aim of this research is to investigate whether regime-aware deep learning models endowed with uncertainty quantification can deliver more accurate and more reliable forecasts of realised equity-index volatility than either classical econometric models or standard deep learning baselines. To pursue this aim, four objectives are pursued: (i) to implement and benchmark econometric baselines, specifically GARCH(1,1) and EGARCH, on daily realised volatility constructed from intraday returns; (ii) to develop an LSTM baseline over the same forecast horizon and evaluation splits, given an input set comparable to the econometric baselines — realised-volatility history as used by HAR-RV together with the daily return used by the GARCH family — and, to separate the contribution of the deep architecture from that of the richer input set, to benchmark alongside it a realised-volatility-only LSTM whose inputs match HAR-RV exactly; (iii) to identify latent market regimes using probabilistic state-space methods, principally Hidden Markov Models, and to condition the deep model on the inferred state through two complementary architectures, a regime-as-feature model and a regime-specific mixture-of-experts; and (iv) to integrate uncertainty quantification through Monte Carlo Dropout and quantile regression, evaluating both the sharpness and the calibration of the resulting predictive intervals.</w:t>
       </w:r>
     </w:p>
     <w:p>
@@ -130,7 +130,7 @@
         <w:t>RQ1:</w:t>
       </w:r>
       <w:r>
-        <w:t xml:space="preserve"> Do LSTM-based deep learning models produce lower out-of-sample forecast error than GARCH-family baselines for daily realised volatility on major equity indices? </w:t>
+        <w:t xml:space="preserve"> Do LSTM-based deep learning models produce lower out-of-sample forecast error than GARCH-family baselines for daily realised volatility on a major equity index, the S&amp;P 500? </w:t>
       </w:r>
       <w:r>
         <w:rPr>

</xml_diff>

<commit_message>
Chapter 1 finalised and aligned with the code; roadmap restated
- HAR-RV named in objective (i) and RQ1; Corsi (2009) added
- Jump-penalised HMM named in objective (iii) and 1.7
- VIX ablation and its separate reporting stated in objective (ii)
- RQ2 restored to the plan-of-record framing (transitional or crisis)
- 1.7: anchored walk-forward, train-only regime estimation, QLIKE primary,
  Giacomini-White and Model Confidence Set added (+4 references)
- Yang-Zhang reframed as a target-validity diagnostic
- 18/18 Ch1 claims verified against configs and code
</commit_message>
<xml_diff>
--- a/Report Draft/Chapter1-Introduction.docx
+++ b/Report Draft/Chapter1-Introduction.docx
@@ -103,7 +103,7 @@
         <w:jc w:val="both"/>
       </w:pPr>
       <w:r>
-        <w:t>The aim of this research is to investigate whether regime-aware deep learning models endowed with uncertainty quantification can deliver more accurate and more reliable forecasts of realised equity-index volatility than either classical econometric models or standard deep learning baselines. To pursue this aim, four objectives are pursued: (i) to implement and benchmark econometric baselines, specifically GARCH(1,1) and EGARCH, on daily realised volatility constructed from intraday returns; (ii) to develop an LSTM baseline over the same forecast horizon and evaluation splits, given an input set comparable to the econometric baselines — realised-volatility history as used by HAR-RV together with the daily return used by the GARCH family — and, to separate the contribution of the deep architecture from that of the richer input set, to benchmark alongside it a realised-volatility-only LSTM whose inputs match HAR-RV exactly; (iii) to identify latent market regimes using probabilistic state-space methods, principally Hidden Markov Models, and to condition the deep model on the inferred state through two complementary architectures, a regime-as-feature model and a regime-specific mixture-of-experts; and (iv) to integrate uncertainty quantification through Monte Carlo Dropout and quantile regression, evaluating both the sharpness and the calibration of the resulting predictive intervals.</w:t>
+        <w:t>The aim of this research is to investigate whether regime-aware deep learning models endowed with uncertainty quantification can deliver more accurate and more reliable forecasts of realised equity-index volatility than either classical econometric models or standard deep learning baselines. To pursue this aim, four objectives are pursued: (i) to implement and benchmark econometric baselines on daily realised volatility constructed from intraday returns, namely GARCH(1,1) and EGARCH from the conditional-variance tradition together with the heterogeneous autoregressive model of realised volatility, HAR-RV (Corsi, 2009), which is the de facto benchmark on realised-volatility targets and therefore the baseline any deep alternative must clear; (ii) to develop an LSTM baseline over the same forecast horizon and evaluation splits, given an input set comparable to the econometric baselines — realised-volatility history as used by HAR-RV together with the daily return used by the GARCH family — and, to separate the contribution of the deep architecture from that of the richer input set, to benchmark alongside it a realised-volatility-only LSTM whose inputs match HAR-RV exactly, together with a further ablation that adds the VIX as an auxiliary input and is reported separately from the like-for-like comparison because it draws on information no other model in that comparison can access; (iii) to identify latent market regimes using probabilistic state-space methods, principally a Gaussian-emission Hidden Markov Model estimated with the jump penalty of Nystrup, Lindström and Madsen (2020), which suppresses the excessive state switching that would otherwise contaminate any forecast conditioned on it, and to condition the deep model on the inferred state through two complementary architectures, a regime-as-feature model and a regime-specific mixture-of-experts; and (iv) to integrate uncertainty quantification through Monte Carlo Dropout and quantile regression, evaluating both the sharpness and the calibration of the resulting predictive intervals.</w:t>
       </w:r>
     </w:p>
     <w:p>
@@ -130,7 +130,7 @@
         <w:t>RQ1:</w:t>
       </w:r>
       <w:r>
-        <w:t xml:space="preserve"> Do LSTM-based deep learning models produce lower out-of-sample forecast error than GARCH-family baselines for daily realised volatility on a major equity index, the S&amp;P 500? </w:t>
+        <w:t xml:space="preserve"> Do LSTM-based deep learning models produce lower out-of-sample forecast error than the econometric baselines GARCH(1,1), EGARCH and HAR-RV for daily realised volatility on a major equity index, the S&amp;P 500? </w:t>
       </w:r>
       <w:r>
         <w:rPr>
@@ -140,7 +140,7 @@
         <w:t>RQ2:</w:t>
       </w:r>
       <w:r>
-        <w:t xml:space="preserve"> Does explicit conditioning on latent market regimes improve forecast accuracy, particularly during high-volatility states? </w:t>
+        <w:t xml:space="preserve"> Does explicit conditioning on latent market regimes improve forecast accuracy, and if so, is the improvement concentrated in transitional or crisis periods rather than spread evenly across the sample? </w:t>
       </w:r>
       <w:r>
         <w:rPr>
@@ -167,7 +167,7 @@
         <w:jc w:val="both"/>
       </w:pPr>
       <w:r>
-        <w:t xml:space="preserve">Methodologically, the project combines econometric, deep learning, and probabilistic components within a unified comparative-evaluation design. Realised volatility is measured as daily realised variance built from five-minute intraday returns (Andersen et al., 2003), sourced from the Oxford-Man Realized Library, econometric and deep-learning models are trained under a strict time-ordered split with rolling out-of-sample evaluation to prevent look-ahead bias, regimes are inferred from observable market signals using a Gaussian-emission HMM and uncertainty is estimated using stochastic forward passes (MC Dropout) and quantile-based loss functions. Models are compared on point-forecast metrics (MSE, MAE, QLIKE) and, for uncertainty-aware variants, on coverage and interval score, with the Diebold–Mariano test used to assess statistical significance of pairwise differences.</w:t>
+        <w:t>Methodologically, the project combines econometric, deep learning, and probabilistic components within a unified comparative-evaluation design. Realised volatility is measured as daily realised variance built from five-minute intraday returns (Andersen et al., 2003), sourced from the Oxford-Man Realized Library, econometric and deep-learning models are trained under a strict time-ordered split with anchored walk-forward out-of-sample evaluation to prevent look-ahead bias, regimes are inferred from observable market signals using a jump-penalised Gaussian-emission HMM whose parameters and posterior are estimated on training data only, and uncertainty is estimated using stochastic forward passes (MC Dropout) and quantile-based loss functions. Models are compared on three point-forecast metrics — MSE, MAE and QLIKE, the last adopted as the primary criterion for its robustness to an imperfect volatility proxy (Patton, 2011) — and, for uncertainty-aware variants, on coverage and interval score. Statistical significance is assessed with the Diebold–Mariano test for pairwise differences, the Giacomini–White test of conditional predictive ability where the question is whether one model is better in identifiable market states rather than on average (Giacomini and White, 2006), and the Model Confidence Set to control the family-wise error rate across the full set of competing models (Hansen, Lunde and Nason, 2011).</w:t>
       </w:r>
     </w:p>
     <w:p>
@@ -184,7 +184,7 @@
         <w:jc w:val="both"/>
       </w:pPr>
       <w:r>
-        <w:t xml:space="preserve">The empirical analysis draws on two complementary data sources. The forecasting target is the daily realised variance of the S&amp;P 500, constructed from five-minute intraday returns in the sense of Andersen et al. (2003) and obtained from the Oxford-Man Realized Library (Heber et al., 2009); the series runs from 2000 to February 2022, when the library was discontinued, and this defines the sample period. Daily market data for the S&amp;P 500 (^GSPC) and the CBOE Volatility Index (^VIX) are taken from Yahoo Finance via the yfinance interface, supplemented where appropriate by individual large-cap equities; these supply the daily returns used by the GARCH-family baselines, the VIX as an auxiliary feature, and the Yang–Zhang OHLC estimator retained as a robustness check on the realised-volatility target. Together the series span multiple distinct market regimes, including the 2008 global financial crisis, the 2018 volatility shock, and the COVID-19 pandemic, and provide a transparent, fully reproducible foundation for the experiments that follow.</w:t>
+        <w:t>The empirical analysis draws on two complementary data sources. The forecasting target is the daily realised variance of the S&amp;P 500, constructed from five-minute intraday returns in the sense of Andersen et al. (2003) and obtained from the Oxford-Man Realized Library (Heber et al., 2009); the series runs from 2000 to February 2022, when the library was discontinued, and this defines the sample period. Daily market data for the S&amp;P 500 (^GSPC) and the CBOE Volatility Index (^VIX) are taken from Yahoo Finance via the yfinance interface, supplemented where appropriate by individual large-cap equities; these supply the daily returns used by the GARCH-family baselines, the VIX as an auxiliary feature, and the Yang–Zhang OHLC estimator, which is retained not as a competing forecasting target but as a target-validity diagnostic: its rolling-window construction imposes a degree of smoothing that the intraday measure does not, and demonstrating this is what justifies the choice of a genuine intraday realised-variance target. Together the series span multiple distinct market regimes, including the 2008 global financial crisis, the 2018 volatility shock, and the COVID-19 pandemic, and provide a transparent, fully reproducible foundation for the experiments that follow.</w:t>
       </w:r>
     </w:p>
     <w:p>
@@ -281,6 +281,15 @@
         <w:ind w:left="720" w:hanging="720"/>
       </w:pPr>
       <w:r>
+        <w:t>Corsi, F., 2009. A simple approximate long-memory model of realized volatility. Journal of Financial Econometrics, 7(2), pp.174–196. https://doi.org/10.1093/jjfinec/nbp001</w:t>
+      </w:r>
+    </w:p>
+    <w:p>
+      <w:pPr>
+        <w:spacing w:after="140" w:line="320" w:lineRule="auto"/>
+        <w:ind w:left="720" w:hanging="720"/>
+      </w:pPr>
+      <w:r>
         <w:lastRenderedPageBreak/>
         <w:t>Engle, R.F., 1982. Autoregressive conditional heteroscedasticity with estimates of the variance of United Kingdom inflation. Econometrica, 50(4), pp.987–1007. https://doi.org/10.2307/1912773</w:t>
       </w:r>
@@ -300,6 +309,15 @@
         <w:ind w:left="720" w:hanging="720"/>
       </w:pPr>
       <w:r>
+        <w:t>Giacomini, R. and White, H., 2006. Tests of conditional predictive ability. Econometrica, 74(6), pp.1545–1578. https://doi.org/10.1111/j.1468-0262.2006.00718.x</w:t>
+      </w:r>
+    </w:p>
+    <w:p>
+      <w:pPr>
+        <w:spacing w:after="140" w:line="320" w:lineRule="auto"/>
+        <w:ind w:left="720" w:hanging="720"/>
+      </w:pPr>
+      <w:r>
         <w:t>Hamilton, J.D., 1989. A new approach to the economic analysis of nonstationary time series and the business cycle. Econometrica, 57(2), pp.357–384. https://doi.org/10.2307/1912559</w:t>
       </w:r>
     </w:p>
@@ -309,6 +327,15 @@
         <w:ind w:left="720" w:hanging="720"/>
       </w:pPr>
       <w:r>
+        <w:t>Hansen, P.R., Lunde, A. and Nason, J.M., 2011. The model confidence set. Econometrica, 79(2), pp.453–497. https://doi.org/10.3982/ECTA5771</w:t>
+      </w:r>
+    </w:p>
+    <w:p>
+      <w:pPr>
+        <w:spacing w:after="140" w:line="320" w:lineRule="auto"/>
+        <w:ind w:left="720" w:hanging="720"/>
+      </w:pPr>
+      <w:r>
         <w:t>Heber, G., Lunde, A., Shephard, N. and Sheppard, K., 2009. Oxford-Man Institute’s realized library. Oxford-Man Institute, University of Oxford.</w:t>
       </w:r>
     </w:p>
@@ -337,6 +364,24 @@
       </w:pPr>
       <w:r>
         <w:t>Mandelbrot, B., 1963. The variation of certain speculative prices. The Journal of Business, 36(4), pp.394–419. https://doi.org/10.1086/294632</w:t>
+      </w:r>
+    </w:p>
+    <w:p>
+      <w:pPr>
+        <w:spacing w:after="140" w:line="320" w:lineRule="auto"/>
+        <w:ind w:left="720" w:hanging="720"/>
+      </w:pPr>
+      <w:r>
+        <w:t>Nystrup, P., Lindström, E. and Madsen, H., 2020. Learning hidden Markov models with persistent states by penalizing jumps. Expert Systems with Applications, 150, 113307. https://doi.org/10.1016/j.eswa.2020.113307</w:t>
+      </w:r>
+    </w:p>
+    <w:p>
+      <w:pPr>
+        <w:spacing w:after="140" w:line="320" w:lineRule="auto"/>
+        <w:ind w:left="720" w:hanging="720"/>
+      </w:pPr>
+      <w:r>
+        <w:t>Patton, A.J., 2011. Volatility forecast comparison using imperfect volatility proxies. Journal of Econometrics, 160(1), pp.246–256. https://doi.org/10.1016/j.jeconom.2010.03.034</w:t>
       </w:r>
     </w:p>
     <w:p>

</xml_diff>